<commit_message>
docs: correct W04 reporting period to 20–26 Oct 2026
</commit_message>
<xml_diff>
--- a/docs/management/weekly/W04-status.docx
+++ b/docs/management/weekly/W04-status.docx
@@ -1625,7 +1625,7 @@
                 <w:szCs w:val="18"/>
                 <w:rtl w:val="0"/>
               </w:rPr>
-              <w:t xml:space="preserve">W04 – 19/10/2026 to 25/10/2026 (Asia/Ho_Chi_Minh)</w:t>
+              <w:t>W04 – 20/10/2026 to 26/10/2026 (Asia/Ho_Chi_Minh)</w:t>
             </w:r>
             <w:r>
               <w:rPr>
@@ -1682,7 +1682,7 @@
                 <w:szCs w:val="18"/>
                 <w:rtl w:val="0"/>
               </w:rPr>
-              <w:t xml:space="preserve">Not verified. Work updates recorded asynchronously through GitHub Issues/PRs.</w:t>
+              <w:t>Two team meetings during W04 (20–26/10); exact meeting dates/times not recorded.</w:t>
             </w:r>
             <w:r>
               <w:rPr>
@@ -1796,7 +1796,7 @@
                 <w:szCs w:val="18"/>
                 <w:rtl w:val="0"/>
               </w:rPr>
-              <w:t xml:space="preserve">Nguyễn Đức Hưng – Team Lead | prepared 26/10/2026</w:t>
+              <w:t>Nguyễn Đức Hưng – Team Lead | revised 27/10/2026</w:t>
             </w:r>
             <w:r>
               <w:rPr>
@@ -1853,7 +1853,7 @@
                 <w:szCs w:val="18"/>
                 <w:rtl w:val="0"/>
               </w:rPr>
-              <w:t xml:space="preserve">AMBER (at risk): PA1 archived; PA2 component documents merged, but integrated SRS/BR evidence and meeting record require confirmation.</w:t>
+              <w:t>AMBER (at risk): PA1 archived and all four PA2 component work packages merged (incl. BR on 26/10); consolidated SRS validation and formal meeting evidence remain to be confirmed.</w:t>
             </w:r>
             <w:r>
               <w:rPr>
@@ -1900,7 +1900,7 @@
         <w:rPr>
           <w:rtl w:val="0"/>
         </w:rPr>
-        <w:t xml:space="preserve">Task owners and PA2 deadlines follow GitHub Issues #60–#63. Evidence is the linked PR/commit history. An issue marked closed is not treated as proof that its deliverable is on main.</w:t>
+        <w:t>Task owners and PA2 deadlines follow GitHub Issues #60–#63. Completed work is evidenced by merged PRs; formal SRS integration and group sign-off remain pending.</w:t>
       </w:r>
     </w:p>
     <w:tbl>
@@ -2285,7 +2285,7 @@
                 <w:szCs w:val="18"/>
                 <w:rtl w:val="0"/>
               </w:rPr>
-              <w:t xml:space="preserve">PR #51, #56–59 merged</w:t>
+              <w:t>PRs #56–#59 merged 20/10; PA1 archive</w:t>
             </w:r>
             <w:r>
               <w:rPr>
@@ -2927,7 +2927,7 @@
                 <w:szCs w:val="18"/>
                 <w:rtl w:val="0"/>
               </w:rPr>
-              <w:t xml:space="preserve">PR #71 merged 26/10</w:t>
+              <w:t>PR #71 merged 26/10; artifact on main</w:t>
             </w:r>
             <w:r>
               <w:rPr>
@@ -4076,7 +4076,7 @@
                 <w:szCs w:val="18"/>
                 <w:rtl w:val="0"/>
               </w:rPr>
-              <w:t xml:space="preserve">BR artifact and meeting proof N/V</w:t>
+              <w:t>Exact meeting times/attendance evidence N/V</w:t>
             </w:r>
             <w:r>
               <w:rPr>
@@ -4126,7 +4126,7 @@
                 <w:szCs w:val="18"/>
                 <w:rtl w:val="0"/>
               </w:rPr>
-              <w:t xml:space="preserve">Collect BR file and minutes</w:t>
+              <w:t>Confirm both meetings and retain minutes</w:t>
             </w:r>
             <w:r>
               <w:rPr>
@@ -4233,7 +4233,7 @@
         <w:rPr>
           <w:rtl w:val="0"/>
         </w:rPr>
-        <w:t xml:space="preserve">During W04, the team held two meetings to coordinate PA2 development and review the CourtMate SRS.</w:t>
+        <w:t>During W04 (20–26/10/2026), the team held two meetings to coordinate PA2 development and review the CourtMate SRS; exact times and attendance evidence should be confirmed.</w:t>
       </w:r>
     </w:p>
     <w:p>
@@ -4247,13 +4247,12 @@
           <w:bCs w:val="1"/>
           <w:rtl w:val="0"/>
         </w:rPr>
-        <w:t xml:space="preserve">Meeting 1 – Task Assignment:</w:t>
+        <w:t>Meeting 1 – Task Assignment: The team assigned PA2 responsibilities across Sections 1–5, designated reviewers, and agreed on deliverables and deadlines. GitHub Issues #60–#63 were created to track individual assignments.</w:t>
       </w:r>
       <w:r>
         <w:rPr>
           <w:rtl w:val="0"/>
         </w:rPr>
-        <w:t xml:space="preserve"> The team assigned PA2 responsibilities across Sections 1–5, designated reviewers, and agreed on deliverables and deadlines. GitHub Issues #60–#63 were created to track individual assignments.</w:t>
       </w:r>
     </w:p>
     <w:p>
@@ -4267,13 +4266,12 @@
           <w:bCs w:val="1"/>
           <w:rtl w:val="0"/>
         </w:rPr>
-        <w:t xml:space="preserve">Meeting 2 – SRS Review and Alignment:</w:t>
+        <w:t>Meeting 2 – SRS Review and Alignment: The team discussed the consolidated FRs, NFRs, BRs and ACs, including owner-published booking slots, cancellation eligibility, role provisioning and Open Play Room capacity. Policy decisions and acceptance criteria require final team validation against the integrated SRS.</w:t>
       </w:r>
       <w:r>
         <w:rPr>
           <w:rtl w:val="0"/>
         </w:rPr>
-        <w:t xml:space="preserve"> The team reviewed the consolidated Functional Requirements, Non-Functional Requirements, Business Rules, and Acceptance Criteria. Key discussions covered booking availability, cancellation policies, Court Owner permissions, Open Play Rooms, and requirement consistency. The team agreed to maintain a unified SRS for subsequent use case modeling, UI design, and testing.</w:t>
       </w:r>
     </w:p>
     <w:p>
@@ -4285,7 +4283,7 @@
         <w:rPr>
           <w:rtl w:val="0"/>
         </w:rPr>
-        <w:t xml:space="preserve">During the week, PA2 PRs #64, #68, and #70 were merged. Final document integration and cross-section validation remained follow-up activities.</w:t>
+        <w:t>During the reporting period, PA2 PRs #64 (NFR), #68 (FR/AC), #70 (FR/AC) and #71 (BR, merged 26/10) reached main. Final integrated SRS review, UI alignment and formal team sign-off remain follow-up work.</w:t>
       </w:r>
     </w:p>
     <w:p>
@@ -4314,7 +4312,6 @@
     <w:tbl>
       <w:tblPr>
         <w:tblStyle w:val="Table5"/>
-        <w:tblpPr w:leftFromText="180" w:rightFromText="180" w:topFromText="180" w:bottomFromText="180" w:vertAnchor="text" w:horzAnchor="text" w:tblpX="-60" w:tblpY="0"/>
         <w:tblW w:w="9357.0" w:type="dxa"/>
         <w:jc w:val="left"/>
         <w:tblInd w:w="-108.0" w:type="dxa"/>
@@ -5180,7 +5177,7 @@
                 <w:szCs w:val="18"/>
                 <w:rtl w:val="0"/>
               </w:rPr>
-              <w:t xml:space="preserve">5 verified items; #63 needs artifact</w:t>
+              <w:t>5 completed work packages; #63 evidenced by PR #71</w:t>
             </w:r>
             <w:r>
               <w:rPr>
@@ -5261,32 +5258,32 @@
                 <w:szCs w:val="18"/>
                 <w:rtl w:val="0"/>
               </w:rPr>
-              <w:t xml:space="preserve">16 main + 1 bootstrap branch</w:t>
-            </w:r>
-            <w:r>
-              <w:rPr>
-                <w:rtl w:val="0"/>
-              </w:rPr>
-            </w:r>
-          </w:p>
-        </w:tc>
-        <w:tc>
-          <w:tcPr>
-            <w:vAlign w:val="center"/>
-          </w:tcPr>
-          <w:p>
-            <w:pPr>
-              <w:spacing w:after="0" w:before="0" w:lineRule="auto"/>
-              <w:jc w:val="left"/>
-              <w:rPr/>
-            </w:pPr>
-            <w:r>
-              <w:rPr>
-                <w:sz w:val="18"/>
-                <w:szCs w:val="18"/>
-                <w:rtl w:val="0"/>
-              </w:rPr>
-              <w:t xml:space="preserve">38 on main</w:t>
+              <w:t>17 commits on main + 1 bootstrap branch commit</w:t>
+            </w:r>
+            <w:r>
+              <w:rPr>
+                <w:rtl w:val="0"/>
+              </w:rPr>
+            </w:r>
+          </w:p>
+        </w:tc>
+        <w:tc>
+          <w:tcPr>
+            <w:vAlign w:val="center"/>
+          </w:tcPr>
+          <w:p>
+            <w:pPr>
+              <w:spacing w:after="0" w:before="0" w:lineRule="auto"/>
+              <w:jc w:val="left"/>
+              <w:rPr/>
+            </w:pPr>
+            <w:r>
+              <w:rPr>
+                <w:sz w:val="18"/>
+                <w:szCs w:val="18"/>
+                <w:rtl w:val="0"/>
+              </w:rPr>
+              <w:t>40 commits on main at 26/10 cutoff</w:t>
             </w:r>
             <w:r>
               <w:rPr>
@@ -5342,32 +5339,32 @@
                 <w:szCs w:val="18"/>
                 <w:rtl w:val="0"/>
               </w:rPr>
-              <w:t xml:space="preserve">8 merged; reviews N/V</w:t>
-            </w:r>
-            <w:r>
-              <w:rPr>
-                <w:rtl w:val="0"/>
-              </w:rPr>
-            </w:r>
-          </w:p>
-        </w:tc>
-        <w:tc>
-          <w:tcPr>
-            <w:vAlign w:val="center"/>
-          </w:tcPr>
-          <w:p>
-            <w:pPr>
-              <w:spacing w:after="0" w:before="0" w:lineRule="auto"/>
-              <w:jc w:val="left"/>
-              <w:rPr/>
-            </w:pPr>
-            <w:r>
-              <w:rPr>
-                <w:sz w:val="18"/>
-                <w:szCs w:val="18"/>
-                <w:rtl w:val="0"/>
-              </w:rPr>
-              <w:t xml:space="preserve">17 merged total</w:t>
+              <w:t>8 merged (PRs #56–#59, #64, #68, #70, #71); reviews N/V</w:t>
+            </w:r>
+            <w:r>
+              <w:rPr>
+                <w:rtl w:val="0"/>
+              </w:rPr>
+            </w:r>
+          </w:p>
+        </w:tc>
+        <w:tc>
+          <w:tcPr>
+            <w:vAlign w:val="center"/>
+          </w:tcPr>
+          <w:p>
+            <w:pPr>
+              <w:spacing w:after="0" w:before="0" w:lineRule="auto"/>
+              <w:jc w:val="left"/>
+              <w:rPr/>
+            </w:pPr>
+            <w:r>
+              <w:rPr>
+                <w:sz w:val="18"/>
+                <w:szCs w:val="18"/>
+                <w:rtl w:val="0"/>
+              </w:rPr>
+              <w:t>18 merged PRs total at 26/10 cutoff</w:t>
             </w:r>
             <w:r>
               <w:rPr>
@@ -5469,7 +5466,7 @@
           <w:szCs w:val="16"/>
           <w:rtl w:val="0"/>
         </w:rPr>
-        <w:t xml:space="preserve">Evidence: PRs #51, #56–#59, #64, #68, #70; Issues #60–#63. Repo: https://github.com/hungstupid/CourtMate</w:t>
+        <w:t>Evidence (20–26/10): PRs #56–#59, #64, #68, #70, #71; Issues #60–#63. Repo: https://github.com/hungstupid/CourtMate</w:t>
       </w:r>
       <w:r>
         <w:rPr>
@@ -5487,7 +5484,7 @@
           <w:szCs w:val="16"/>
           <w:rtl w:val="0"/>
         </w:rPr>
-        <w:t xml:space="preserve">PA2 PRs: https://github.com/hungstupid/CourtMate/pull/64 ; /pull/68 ; /pull/70 (under same repository).</w:t>
+        <w:t>PA2 PRs: https://github.com/hungstupid/CourtMate/pull/64 ; /pull/68 ; /pull/70 ; /pull/71 (same repository).</w:t>
       </w:r>
       <w:r>
         <w:rPr>
@@ -5505,7 +5502,7 @@
           <w:szCs w:val="16"/>
           <w:rtl w:val="0"/>
         </w:rPr>
-        <w:t xml:space="preserve">Bootstrap evidence: commit b7a393b on chore/project-bootstrap (25/10); not merged as of W04.</w:t>
+        <w:t>Bootstrap evidence: commit b7a393b on chore/project-bootstrap (25/10); not merged as of 26/10 cutoff.</w:t>
       </w:r>
       <w:r>
         <w:rPr>
@@ -5523,7 +5520,7 @@
           <w:szCs w:val="16"/>
           <w:rtl w:val="0"/>
         </w:rPr>
-        <w:t xml:space="preserve">Reporting boundary: 19–25/10/2026. Changes dated 26/10 or later are excluded.</w:t>
+        <w:t>Reporting boundary: 20/10/2026 00:00 through 26/10/2026 23:59 (Asia/Ho_Chi_Minh). Changes on 26/10 are included; activity on 19/10 and from 27/10 onward is excluded.</w:t>
       </w:r>
       <w:r>
         <w:rPr>

</xml_diff>